<commit_message>
Add PyTorch MLP forecaster for time series
</commit_message>
<xml_diff>
--- a/examples/timeseries/doc/README.docx
+++ b/examples/timeseries/doc/README.docx
@@ -2,7 +2,7 @@
 <file path=word/document.xml><?xml version="1.0" encoding="utf-8"?>
 <w:document xmlns:w="http://schemas.openxmlformats.org/wordprocessingml/2006/main" xmlns:m="http://schemas.openxmlformats.org/officeDocument/2006/math" xmlns:r="http://schemas.openxmlformats.org/officeDocument/2006/relationships" xmlns:o="urn:schemas-microsoft-com:office:office" xmlns:v="urn:schemas-microsoft-com:vml" xmlns:w10="urn:schemas-microsoft-com:office:word" xmlns:a="http://schemas.openxmlformats.org/drawingml/2006/main" xmlns:pic="http://schemas.openxmlformats.org/drawingml/2006/picture" xmlns:wp="http://schemas.openxmlformats.org/drawingml/2006/wordprocessingDrawing">
   <w:body>
-    <w:bookmarkStart w:id="13" w:name="time-series-examples"/>
+    <w:bookmarkStart w:id="14" w:name="time-series-examples"/>
     <w:p>
       <w:pPr>
         <w:pStyle w:val="Heading1"/>
@@ -187,7 +187,29 @@
         <w:t xml:space="preserve">— Forecasts one step ahead from lagged windows using a PyTorch Conv1D model.</w:t>
       </w:r>
     </w:p>
-    <w:bookmarkEnd w:id="13"/>
+    <w:p>
+      <w:pPr>
+        <w:numPr>
+          <w:ilvl w:val="0"/>
+          <w:numId w:val="1001"/>
+        </w:numPr>
+      </w:pPr>
+      <w:hyperlink r:id="rId13">
+        <w:r>
+          <w:rPr>
+            <w:rStyle w:val="Hyperlink"/>
+          </w:rPr>
+          <w:t xml:space="preserve">torch_ts_mlp.md</w:t>
+        </w:r>
+      </w:hyperlink>
+      <w:r>
+        <w:t xml:space="preserve"> </w:t>
+      </w:r>
+      <w:r>
+        <w:t xml:space="preserve">— Forecasts one step ahead from lagged windows using a feedforward PyTorch MLP.</w:t>
+      </w:r>
+    </w:p>
+    <w:bookmarkEnd w:id="14"/>
     <w:sectPr>
       <w:footnotePr>
         <w:numRestart w:val="eachSect"/>

</xml_diff>